<commit_message>
Close page gaps: pair figures side by side, trim figure sizes (7 pages)
Co-Authored-By: Claude Opus 5.5 <noreply@anthropic.com>
Claude-Session: https://claude.ai/code/session_019knRdjk5gjNVj1XdaUpgVu
</commit_message>
<xml_diff>
--- a/cybercrime-assignment/final/24-Ahnaf_Akif.docx
+++ b/cybercrime-assignment/final/24-Ahnaf_Akif.docx
@@ -318,7 +318,6 @@
     <w:p>
       <w:pPr>
         <w:pStyle w:val="Heading1"/>
-        <w:keepNext/>
         <w:spacing w:before="240" w:after="120" w:line="360" w:lineRule="auto"/>
         <w:rPr>
           <w:b w:val="0"/>
@@ -338,7 +337,6 @@
     <w:p>
       <w:pPr>
         <w:pStyle w:val="Heading1"/>
-        <w:keepNext/>
         <w:spacing w:before="240" w:after="120" w:line="360" w:lineRule="auto"/>
         <w:rPr>
           <w:b w:val="0"/>
@@ -386,103 +384,6 @@
     </w:p>
     <w:p>
       <w:pPr>
-        <w:keepNext/>
-        <w:spacing w:before="120" w:line="360" w:lineRule="auto"/>
-      </w:pPr>
-      <w:r>
-        <w:rPr>
-          <w:b/>
-          <w:bCs/>
-        </w:rPr>
-        <w:t>Figure 1</w:t>
-      </w:r>
-    </w:p>
-    <w:p>
-      <w:pPr>
-        <w:keepNext/>
-        <w:spacing w:after="60" w:line="360" w:lineRule="auto"/>
-      </w:pPr>
-      <w:r>
-        <w:rPr>
-          <w:i/>
-          <w:iCs/>
-        </w:rPr>
-        <w:t>Facebook → Settings &amp; privacy → Accounts Center → Login and security</w:t>
-      </w:r>
-    </w:p>
-    <w:p>
-      <w:pPr>
-        <w:keepNext/>
-        <w:spacing w:before="60" w:after="60"/>
-        <w:jc w:val="center"/>
-      </w:pPr>
-      <w:r>
-        <w:rPr>
-          <w:noProof/>
-        </w:rPr>
-        <w:drawing>
-          <wp:inline distT="0" distB="0" distL="0" distR="0" wp14:anchorId="797DE5C2" wp14:editId="6DE43B5C">
-            <wp:extent cx="1600200" cy="2150491"/>
-            <wp:effectExtent l="0" t="0" r="0" b="0"/>
-            <wp:docPr id="822376994" name="fig1" descr="Facebook → Settings &amp; privacy → Accounts Center → Login and security" title="Facebook → Settings &amp; privacy → Accounts Center → Login and security"/>
-            <wp:cNvGraphicFramePr>
-              <a:graphicFrameLocks xmlns:a="http://schemas.openxmlformats.org/drawingml/2006/main" noChangeAspect="1"/>
-            </wp:cNvGraphicFramePr>
-            <a:graphic xmlns:a="http://schemas.openxmlformats.org/drawingml/2006/main">
-              <a:graphicData uri="http://schemas.openxmlformats.org/drawingml/2006/picture">
-                <pic:pic xmlns:pic="http://schemas.openxmlformats.org/drawingml/2006/picture">
-                  <pic:nvPicPr>
-                    <pic:cNvPr id="0" name=""/>
-                    <pic:cNvPicPr>
-                      <a:picLocks noChangeAspect="1" noChangeArrowheads="1"/>
-                    </pic:cNvPicPr>
-                  </pic:nvPicPr>
-                  <pic:blipFill>
-                    <a:blip r:embed="rId8"/>
-                    <a:srcRect/>
-                    <a:stretch>
-                      <a:fillRect/>
-                    </a:stretch>
-                  </pic:blipFill>
-                  <pic:spPr bwMode="auto">
-                    <a:xfrm>
-                      <a:off x="0" y="0"/>
-                      <a:ext cx="1600200" cy="2150491"/>
-                    </a:xfrm>
-                    <a:prstGeom prst="rect">
-                      <a:avLst/>
-                    </a:prstGeom>
-                  </pic:spPr>
-                </pic:pic>
-              </a:graphicData>
-            </a:graphic>
-          </wp:inline>
-        </w:drawing>
-      </w:r>
-    </w:p>
-    <w:p>
-      <w:pPr>
-        <w:spacing w:after="200" w:line="276" w:lineRule="auto"/>
-      </w:pPr>
-      <w:r>
-        <w:rPr>
-          <w:i/>
-          <w:iCs/>
-          <w:sz w:val="20"/>
-          <w:szCs w:val="20"/>
-        </w:rPr>
-        <w:t xml:space="preserve">Note. </w:t>
-      </w:r>
-      <w:r>
-        <w:rPr>
-          <w:sz w:val="20"/>
-          <w:szCs w:val="20"/>
-        </w:rPr>
-        <w:t>Screenshot taken by the author on 25 October 2026.</w:t>
-      </w:r>
-    </w:p>
-    <w:p>
-      <w:pPr>
         <w:pStyle w:val="Heading2"/>
         <w:keepNext/>
         <w:spacing w:before="120" w:after="60" w:line="360" w:lineRule="auto"/>
@@ -500,102 +401,235 @@
         <w:t>Instagram’s login protection features are the same as Facebook’s. Instagram has a unique “Emails from Instagram” feature, which lists the real security emails Instagram has sent in the last 14 days. It protects users from harassment through Restrict, Hidden Words and limits on message requests, which block abusive messages. Teen Accounts are private by default for users under 18. However, Meta removed its optional encrypted chats on 8 May 2026 (Euronews, 2026), which means Meta can access the content of private messages. Instagram is therefore vulnerable to sextortion and image-based blackmail, which often start in private messages.</w:t>
       </w:r>
     </w:p>
-    <w:p>
-      <w:pPr>
-        <w:keepNext/>
-        <w:spacing w:before="120" w:line="360" w:lineRule="auto"/>
-      </w:pPr>
-      <w:r>
-        <w:rPr>
-          <w:b/>
-          <w:bCs/>
-        </w:rPr>
-        <w:t>Figure 2</w:t>
-      </w:r>
-    </w:p>
-    <w:p>
-      <w:pPr>
-        <w:keepNext/>
-        <w:spacing w:after="60" w:line="360" w:lineRule="auto"/>
-      </w:pPr>
-      <w:r>
-        <w:rPr>
-          <w:i/>
-          <w:iCs/>
-        </w:rPr>
-        <w:t>Instagram → Profile → Menu → Accounts Center → Password and security</w:t>
-      </w:r>
-    </w:p>
-    <w:p>
-      <w:pPr>
-        <w:keepNext/>
-        <w:spacing w:before="60" w:after="60"/>
-        <w:jc w:val="center"/>
-      </w:pPr>
-      <w:r>
-        <w:rPr>
-          <w:noProof/>
-        </w:rPr>
-        <w:drawing>
-          <wp:inline distT="0" distB="0" distL="0" distR="0" wp14:anchorId="67C62A3C" wp14:editId="384F3CB4">
-            <wp:extent cx="1828800" cy="1595120"/>
-            <wp:effectExtent l="0" t="0" r="0" b="0"/>
-            <wp:docPr id="234644435" name="fig2" descr="Instagram → Profile → Menu → Accounts Center → Password and security" title="Instagram → Profile → Menu → Accounts Center → Password and security"/>
-            <wp:cNvGraphicFramePr>
-              <a:graphicFrameLocks xmlns:a="http://schemas.openxmlformats.org/drawingml/2006/main" noChangeAspect="1"/>
-            </wp:cNvGraphicFramePr>
-            <a:graphic xmlns:a="http://schemas.openxmlformats.org/drawingml/2006/main">
-              <a:graphicData uri="http://schemas.openxmlformats.org/drawingml/2006/picture">
-                <pic:pic xmlns:pic="http://schemas.openxmlformats.org/drawingml/2006/picture">
-                  <pic:nvPicPr>
-                    <pic:cNvPr id="0" name=""/>
-                    <pic:cNvPicPr>
-                      <a:picLocks noChangeAspect="1" noChangeArrowheads="1"/>
-                    </pic:cNvPicPr>
-                  </pic:nvPicPr>
-                  <pic:blipFill>
-                    <a:blip r:embed="rId9"/>
-                    <a:srcRect/>
-                    <a:stretch>
-                      <a:fillRect/>
-                    </a:stretch>
-                  </pic:blipFill>
-                  <pic:spPr bwMode="auto">
-                    <a:xfrm>
-                      <a:off x="0" y="0"/>
-                      <a:ext cx="1828800" cy="1595120"/>
-                    </a:xfrm>
-                    <a:prstGeom prst="rect">
-                      <a:avLst/>
-                    </a:prstGeom>
-                  </pic:spPr>
-                </pic:pic>
-              </a:graphicData>
-            </a:graphic>
-          </wp:inline>
-        </w:drawing>
-      </w:r>
-    </w:p>
-    <w:p>
-      <w:pPr>
-        <w:spacing w:after="200" w:line="276" w:lineRule="auto"/>
-      </w:pPr>
-      <w:r>
-        <w:rPr>
-          <w:i/>
-          <w:iCs/>
-          <w:sz w:val="20"/>
-          <w:szCs w:val="20"/>
-        </w:rPr>
-        <w:t xml:space="preserve">Note. </w:t>
-      </w:r>
-      <w:r>
-        <w:rPr>
-          <w:sz w:val="20"/>
-          <w:szCs w:val="20"/>
-        </w:rPr>
-        <w:t>Screenshot taken by the author on 25 October 2026.</w:t>
-      </w:r>
+    <w:tbl>
+      <w:tblPr>
+        <w:tblW w:w="9026" w:type="dxa"/>
+        <w:tblLayout w:type="fixed"/>
+        <w:tblBorders>
+          <w:top w:val="nil"/>
+          <w:left w:val="nil"/>
+          <w:bottom w:val="nil"/>
+          <w:right w:val="nil"/>
+          <w:insideH w:val="nil"/>
+          <w:insideV w:val="nil"/>
+        </w:tblBorders>
+        <w:tblCellMar>
+          <w:left w:w="57" w:type="dxa"/>
+          <w:right w:w="113" w:type="dxa"/>
+        </w:tblCellMar>
+      </w:tblPr>
+      <w:tblGrid>
+        <w:gridCol w:w="4513"/>
+        <w:gridCol w:w="4513"/>
+      </w:tblGrid>
+      <w:tr>
+        <w:trPr>
+          <w:cantSplit/>
+        </w:trPr>
+        <w:tc>
+          <w:tcPr>
+            <w:tcW w:w="4513" w:type="dxa"/>
+          </w:tcPr>
+          <w:p>
+            <w:pPr>
+              <w:spacing w:before="120" w:line="264" w:lineRule="auto"/>
+            </w:pPr>
+            <w:r>
+              <w:rPr>
+                <w:b/>
+                <w:bCs/>
+              </w:rPr>
+              <w:t>Figure 1</w:t>
+            </w:r>
+          </w:p>
+          <w:p>
+            <w:pPr>
+              <w:spacing w:after="60" w:line="264" w:lineRule="auto"/>
+            </w:pPr>
+            <w:r>
+              <w:rPr>
+                <w:i/>
+                <w:iCs/>
+              </w:rPr>
+              <w:t>Facebook → Settings &amp; privacy → Accounts Center → Login and security</w:t>
+            </w:r>
+          </w:p>
+          <w:p>
+            <w:pPr>
+              <w:spacing w:before="60" w:after="60"/>
+              <w:jc w:val="center"/>
+            </w:pPr>
+            <w:r>
+              <w:rPr>
+                <w:noProof/>
+              </w:rPr>
+              <w:drawing>
+                <wp:inline distT="0" distB="0" distL="0" distR="0" wp14:anchorId="797DE5C2" wp14:editId="6DE43B5C">
+                  <wp:extent cx="1600200" cy="2150491"/>
+                  <wp:effectExtent l="0" t="0" r="0" b="0"/>
+                  <wp:docPr id="822376994" name="fig1" descr="Facebook → Settings &amp; privacy → Accounts Center → Login and security" title="Facebook → Settings &amp; privacy → Accounts Center → Login and security"/>
+                  <wp:cNvGraphicFramePr>
+                    <a:graphicFrameLocks xmlns:a="http://schemas.openxmlformats.org/drawingml/2006/main" noChangeAspect="1"/>
+                  </wp:cNvGraphicFramePr>
+                  <a:graphic xmlns:a="http://schemas.openxmlformats.org/drawingml/2006/main">
+                    <a:graphicData uri="http://schemas.openxmlformats.org/drawingml/2006/picture">
+                      <pic:pic xmlns:pic="http://schemas.openxmlformats.org/drawingml/2006/picture">
+                        <pic:nvPicPr>
+                          <pic:cNvPr id="0" name=""/>
+                          <pic:cNvPicPr>
+                            <a:picLocks noChangeAspect="1" noChangeArrowheads="1"/>
+                          </pic:cNvPicPr>
+                        </pic:nvPicPr>
+                        <pic:blipFill>
+                          <a:blip r:embed="rId8"/>
+                          <a:srcRect/>
+                          <a:stretch>
+                            <a:fillRect/>
+                          </a:stretch>
+                        </pic:blipFill>
+                        <pic:spPr bwMode="auto">
+                          <a:xfrm>
+                            <a:off x="0" y="0"/>
+                            <a:ext cx="1600200" cy="2150491"/>
+                          </a:xfrm>
+                          <a:prstGeom prst="rect">
+                            <a:avLst/>
+                          </a:prstGeom>
+                        </pic:spPr>
+                      </pic:pic>
+                    </a:graphicData>
+                  </a:graphic>
+                </wp:inline>
+              </w:drawing>
+            </w:r>
+          </w:p>
+          <w:p>
+            <w:pPr>
+              <w:spacing w:after="200" w:line="276" w:lineRule="auto"/>
+            </w:pPr>
+            <w:r>
+              <w:rPr>
+                <w:i/>
+                <w:iCs/>
+                <w:sz w:val="20"/>
+                <w:szCs w:val="20"/>
+              </w:rPr>
+              <w:t xml:space="preserve">Note. </w:t>
+            </w:r>
+            <w:r>
+              <w:rPr>
+                <w:sz w:val="20"/>
+                <w:szCs w:val="20"/>
+              </w:rPr>
+              <w:t>Screenshot taken by the author on 25 October 2026.</w:t>
+            </w:r>
+          </w:p>
+        </w:tc>
+        <w:tc>
+          <w:tcPr>
+            <w:tcW w:w="4513" w:type="dxa"/>
+          </w:tcPr>
+          <w:p>
+            <w:pPr>
+              <w:spacing w:before="120" w:line="264" w:lineRule="auto"/>
+            </w:pPr>
+            <w:r>
+              <w:rPr>
+                <w:b/>
+                <w:bCs/>
+              </w:rPr>
+              <w:t>Figure 2</w:t>
+            </w:r>
+          </w:p>
+          <w:p>
+            <w:pPr>
+              <w:spacing w:after="60" w:line="264" w:lineRule="auto"/>
+            </w:pPr>
+            <w:r>
+              <w:rPr>
+                <w:i/>
+                <w:iCs/>
+              </w:rPr>
+              <w:t>Instagram → Profile → Menu → Accounts Center → Password and security</w:t>
+            </w:r>
+          </w:p>
+          <w:p>
+            <w:pPr>
+              <w:spacing w:before="60" w:after="60"/>
+              <w:jc w:val="center"/>
+            </w:pPr>
+            <w:r>
+              <w:rPr>
+                <w:noProof/>
+              </w:rPr>
+              <w:drawing>
+                <wp:inline distT="0" distB="0" distL="0" distR="0" wp14:anchorId="67C62A3C" wp14:editId="384F3CB4">
+                  <wp:extent cx="1828800" cy="1595120"/>
+                  <wp:effectExtent l="0" t="0" r="0" b="0"/>
+                  <wp:docPr id="234644435" name="fig2" descr="Instagram → Profile → Menu → Accounts Center → Password and security" title="Instagram → Profile → Menu → Accounts Center → Password and security"/>
+                  <wp:cNvGraphicFramePr>
+                    <a:graphicFrameLocks xmlns:a="http://schemas.openxmlformats.org/drawingml/2006/main" noChangeAspect="1"/>
+                  </wp:cNvGraphicFramePr>
+                  <a:graphic xmlns:a="http://schemas.openxmlformats.org/drawingml/2006/main">
+                    <a:graphicData uri="http://schemas.openxmlformats.org/drawingml/2006/picture">
+                      <pic:pic xmlns:pic="http://schemas.openxmlformats.org/drawingml/2006/picture">
+                        <pic:nvPicPr>
+                          <pic:cNvPr id="0" name=""/>
+                          <pic:cNvPicPr>
+                            <a:picLocks noChangeAspect="1" noChangeArrowheads="1"/>
+                          </pic:cNvPicPr>
+                        </pic:nvPicPr>
+                        <pic:blipFill>
+                          <a:blip r:embed="rId9"/>
+                          <a:srcRect/>
+                          <a:stretch>
+                            <a:fillRect/>
+                          </a:stretch>
+                        </pic:blipFill>
+                        <pic:spPr bwMode="auto">
+                          <a:xfrm>
+                            <a:off x="0" y="0"/>
+                            <a:ext cx="1828800" cy="1595120"/>
+                          </a:xfrm>
+                          <a:prstGeom prst="rect">
+                            <a:avLst/>
+                          </a:prstGeom>
+                        </pic:spPr>
+                      </pic:pic>
+                    </a:graphicData>
+                  </a:graphic>
+                </wp:inline>
+              </w:drawing>
+            </w:r>
+          </w:p>
+          <w:p>
+            <w:pPr>
+              <w:spacing w:after="200" w:line="276" w:lineRule="auto"/>
+            </w:pPr>
+            <w:r>
+              <w:rPr>
+                <w:i/>
+                <w:iCs/>
+                <w:sz w:val="20"/>
+                <w:szCs w:val="20"/>
+              </w:rPr>
+              <w:t xml:space="preserve">Note. </w:t>
+            </w:r>
+            <w:r>
+              <w:rPr>
+                <w:sz w:val="20"/>
+                <w:szCs w:val="20"/>
+              </w:rPr>
+              <w:t>Screenshot taken by the author on 25 October 2026.</w:t>
+            </w:r>
+          </w:p>
+        </w:tc>
+      </w:tr>
+    </w:tbl>
+    <w:p>
+      <w:pPr>
+        <w:spacing w:before="0" w:after="0" w:line="120" w:lineRule="exact"/>
+      </w:pPr>
     </w:p>
     <w:p>
       <w:pPr>
@@ -618,103 +652,6 @@
     </w:p>
     <w:p>
       <w:pPr>
-        <w:keepNext/>
-        <w:spacing w:before="120" w:line="360" w:lineRule="auto"/>
-      </w:pPr>
-      <w:r>
-        <w:rPr>
-          <w:b/>
-          <w:bCs/>
-        </w:rPr>
-        <w:t>Figure 3</w:t>
-      </w:r>
-    </w:p>
-    <w:p>
-      <w:pPr>
-        <w:keepNext/>
-        <w:spacing w:after="60" w:line="360" w:lineRule="auto"/>
-      </w:pPr>
-      <w:r>
-        <w:rPr>
-          <w:i/>
-          <w:iCs/>
-        </w:rPr>
-        <w:t>WhatsApp → Settings → Privacy</w:t>
-      </w:r>
-    </w:p>
-    <w:p>
-      <w:pPr>
-        <w:keepNext/>
-        <w:spacing w:before="60" w:after="60"/>
-        <w:jc w:val="center"/>
-      </w:pPr>
-      <w:r>
-        <w:rPr>
-          <w:noProof/>
-        </w:rPr>
-        <w:drawing>
-          <wp:inline distT="0" distB="0" distL="0" distR="0" wp14:anchorId="52D8975D" wp14:editId="5A3399AF">
-            <wp:extent cx="1600200" cy="2450973"/>
-            <wp:effectExtent l="0" t="0" r="0" b="0"/>
-            <wp:docPr id="1862344118" name="fig3" descr="WhatsApp → Settings → Privacy" title="WhatsApp → Settings → Privacy"/>
-            <wp:cNvGraphicFramePr>
-              <a:graphicFrameLocks xmlns:a="http://schemas.openxmlformats.org/drawingml/2006/main" noChangeAspect="1"/>
-            </wp:cNvGraphicFramePr>
-            <a:graphic xmlns:a="http://schemas.openxmlformats.org/drawingml/2006/main">
-              <a:graphicData uri="http://schemas.openxmlformats.org/drawingml/2006/picture">
-                <pic:pic xmlns:pic="http://schemas.openxmlformats.org/drawingml/2006/picture">
-                  <pic:nvPicPr>
-                    <pic:cNvPr id="0" name=""/>
-                    <pic:cNvPicPr>
-                      <a:picLocks noChangeAspect="1" noChangeArrowheads="1"/>
-                    </pic:cNvPicPr>
-                  </pic:nvPicPr>
-                  <pic:blipFill>
-                    <a:blip r:embed="rId10"/>
-                    <a:srcRect/>
-                    <a:stretch>
-                      <a:fillRect/>
-                    </a:stretch>
-                  </pic:blipFill>
-                  <pic:spPr bwMode="auto">
-                    <a:xfrm>
-                      <a:off x="0" y="0"/>
-                      <a:ext cx="1600200" cy="2450973"/>
-                    </a:xfrm>
-                    <a:prstGeom prst="rect">
-                      <a:avLst/>
-                    </a:prstGeom>
-                  </pic:spPr>
-                </pic:pic>
-              </a:graphicData>
-            </a:graphic>
-          </wp:inline>
-        </w:drawing>
-      </w:r>
-    </w:p>
-    <w:p>
-      <w:pPr>
-        <w:spacing w:after="200" w:line="276" w:lineRule="auto"/>
-      </w:pPr>
-      <w:r>
-        <w:rPr>
-          <w:i/>
-          <w:iCs/>
-          <w:sz w:val="20"/>
-          <w:szCs w:val="20"/>
-        </w:rPr>
-        <w:t xml:space="preserve">Note. </w:t>
-      </w:r>
-      <w:r>
-        <w:rPr>
-          <w:sz w:val="20"/>
-          <w:szCs w:val="20"/>
-        </w:rPr>
-        <w:t>Screenshot taken by the author on 25 October 2026.</w:t>
-      </w:r>
-    </w:p>
-    <w:p>
-      <w:pPr>
         <w:pStyle w:val="Heading2"/>
         <w:keepNext/>
         <w:spacing w:before="120" w:after="60" w:line="360" w:lineRule="auto"/>
@@ -732,102 +669,235 @@
         <w:t>Passkeys have been the default sign-in option since October 2023 (Google, 2023). Login protection also includes 2-Step Verification. Google also has an Advanced Protection Program for journalists and activists, which requires a passkey or a physical security key. According to Google, Gmail blocks more than 99.9% of phishing and malware attempts (Engadget, 2025). Suspicious emails also show a red warning banner. Gmail has a privacy tool called confidential mode, which sets an expiry date on an email and stops people from forwarding it. However, while emails are protected in transit, they are not end-to-end encrypted, unlike WhatsApp chats.</w:t>
       </w:r>
     </w:p>
-    <w:p>
-      <w:pPr>
-        <w:keepNext/>
-        <w:spacing w:before="120" w:line="360" w:lineRule="auto"/>
-      </w:pPr>
-      <w:r>
-        <w:rPr>
-          <w:b/>
-          <w:bCs/>
-        </w:rPr>
-        <w:t>Figure 4</w:t>
-      </w:r>
-    </w:p>
-    <w:p>
-      <w:pPr>
-        <w:keepNext/>
-        <w:spacing w:after="60" w:line="360" w:lineRule="auto"/>
-      </w:pPr>
-      <w:r>
-        <w:rPr>
-          <w:i/>
-          <w:iCs/>
-        </w:rPr>
-        <w:t>Gmail → Profile picture → Manage your Google Account → Security and sign-in</w:t>
-      </w:r>
-    </w:p>
-    <w:p>
-      <w:pPr>
-        <w:keepNext/>
-        <w:spacing w:before="60" w:after="60"/>
-        <w:jc w:val="center"/>
-      </w:pPr>
-      <w:r>
-        <w:rPr>
-          <w:noProof/>
-        </w:rPr>
-        <w:drawing>
-          <wp:inline distT="0" distB="0" distL="0" distR="0" wp14:anchorId="089BB2AF" wp14:editId="58228A76">
-            <wp:extent cx="1828800" cy="1782064"/>
-            <wp:effectExtent l="0" t="0" r="0" b="0"/>
-            <wp:docPr id="1351789678" name="fig4" descr="Gmail → Profile picture → Manage your Google Account → Security and sign-in" title="Gmail → Profile picture → Manage your Google Account → Security and sign-in"/>
-            <wp:cNvGraphicFramePr>
-              <a:graphicFrameLocks xmlns:a="http://schemas.openxmlformats.org/drawingml/2006/main" noChangeAspect="1"/>
-            </wp:cNvGraphicFramePr>
-            <a:graphic xmlns:a="http://schemas.openxmlformats.org/drawingml/2006/main">
-              <a:graphicData uri="http://schemas.openxmlformats.org/drawingml/2006/picture">
-                <pic:pic xmlns:pic="http://schemas.openxmlformats.org/drawingml/2006/picture">
-                  <pic:nvPicPr>
-                    <pic:cNvPr id="0" name=""/>
-                    <pic:cNvPicPr>
-                      <a:picLocks noChangeAspect="1" noChangeArrowheads="1"/>
-                    </pic:cNvPicPr>
-                  </pic:nvPicPr>
-                  <pic:blipFill>
-                    <a:blip r:embed="rId11"/>
-                    <a:srcRect/>
-                    <a:stretch>
-                      <a:fillRect/>
-                    </a:stretch>
-                  </pic:blipFill>
-                  <pic:spPr bwMode="auto">
-                    <a:xfrm>
-                      <a:off x="0" y="0"/>
-                      <a:ext cx="1828800" cy="1782064"/>
-                    </a:xfrm>
-                    <a:prstGeom prst="rect">
-                      <a:avLst/>
-                    </a:prstGeom>
-                  </pic:spPr>
-                </pic:pic>
-              </a:graphicData>
-            </a:graphic>
-          </wp:inline>
-        </w:drawing>
-      </w:r>
-    </w:p>
-    <w:p>
-      <w:pPr>
-        <w:spacing w:after="200" w:line="276" w:lineRule="auto"/>
-      </w:pPr>
-      <w:r>
-        <w:rPr>
-          <w:i/>
-          <w:iCs/>
-          <w:sz w:val="20"/>
-          <w:szCs w:val="20"/>
-        </w:rPr>
-        <w:t xml:space="preserve">Note. </w:t>
-      </w:r>
-      <w:r>
-        <w:rPr>
-          <w:sz w:val="20"/>
-          <w:szCs w:val="20"/>
-        </w:rPr>
-        <w:t>Screenshot taken by the author on 25 October 2026; personal details have been cropped out.</w:t>
-      </w:r>
+    <w:tbl>
+      <w:tblPr>
+        <w:tblW w:w="9026" w:type="dxa"/>
+        <w:tblLayout w:type="fixed"/>
+        <w:tblBorders>
+          <w:top w:val="nil"/>
+          <w:left w:val="nil"/>
+          <w:bottom w:val="nil"/>
+          <w:right w:val="nil"/>
+          <w:insideH w:val="nil"/>
+          <w:insideV w:val="nil"/>
+        </w:tblBorders>
+        <w:tblCellMar>
+          <w:left w:w="57" w:type="dxa"/>
+          <w:right w:w="113" w:type="dxa"/>
+        </w:tblCellMar>
+      </w:tblPr>
+      <w:tblGrid>
+        <w:gridCol w:w="4513"/>
+        <w:gridCol w:w="4513"/>
+      </w:tblGrid>
+      <w:tr>
+        <w:trPr>
+          <w:cantSplit/>
+        </w:trPr>
+        <w:tc>
+          <w:tcPr>
+            <w:tcW w:w="4513" w:type="dxa"/>
+          </w:tcPr>
+          <w:p>
+            <w:pPr>
+              <w:spacing w:before="120" w:line="264" w:lineRule="auto"/>
+            </w:pPr>
+            <w:r>
+              <w:rPr>
+                <w:b/>
+                <w:bCs/>
+              </w:rPr>
+              <w:t>Figure 3</w:t>
+            </w:r>
+          </w:p>
+          <w:p>
+            <w:pPr>
+              <w:spacing w:after="60" w:line="264" w:lineRule="auto"/>
+            </w:pPr>
+            <w:r>
+              <w:rPr>
+                <w:i/>
+                <w:iCs/>
+              </w:rPr>
+              <w:t>WhatsApp → Settings → Privacy</w:t>
+            </w:r>
+          </w:p>
+          <w:p>
+            <w:pPr>
+              <w:spacing w:before="60" w:after="60"/>
+              <w:jc w:val="center"/>
+            </w:pPr>
+            <w:r>
+              <w:rPr>
+                <w:noProof/>
+              </w:rPr>
+              <w:drawing>
+                <wp:inline distT="0" distB="0" distL="0" distR="0" wp14:anchorId="52D8975D" wp14:editId="5A3399AF">
+                  <wp:extent cx="1371600" cy="2100834"/>
+                  <wp:effectExtent l="0" t="0" r="0" b="0"/>
+                  <wp:docPr id="1862344118" name="fig3" descr="WhatsApp → Settings → Privacy" title="WhatsApp → Settings → Privacy"/>
+                  <wp:cNvGraphicFramePr>
+                    <a:graphicFrameLocks xmlns:a="http://schemas.openxmlformats.org/drawingml/2006/main" noChangeAspect="1"/>
+                  </wp:cNvGraphicFramePr>
+                  <a:graphic xmlns:a="http://schemas.openxmlformats.org/drawingml/2006/main">
+                    <a:graphicData uri="http://schemas.openxmlformats.org/drawingml/2006/picture">
+                      <pic:pic xmlns:pic="http://schemas.openxmlformats.org/drawingml/2006/picture">
+                        <pic:nvPicPr>
+                          <pic:cNvPr id="0" name=""/>
+                          <pic:cNvPicPr>
+                            <a:picLocks noChangeAspect="1" noChangeArrowheads="1"/>
+                          </pic:cNvPicPr>
+                        </pic:nvPicPr>
+                        <pic:blipFill>
+                          <a:blip r:embed="rId10"/>
+                          <a:srcRect/>
+                          <a:stretch>
+                            <a:fillRect/>
+                          </a:stretch>
+                        </pic:blipFill>
+                        <pic:spPr bwMode="auto">
+                          <a:xfrm>
+                            <a:off x="0" y="0"/>
+                            <a:ext cx="1371600" cy="2100834"/>
+                          </a:xfrm>
+                          <a:prstGeom prst="rect">
+                            <a:avLst/>
+                          </a:prstGeom>
+                        </pic:spPr>
+                      </pic:pic>
+                    </a:graphicData>
+                  </a:graphic>
+                </wp:inline>
+              </w:drawing>
+            </w:r>
+          </w:p>
+          <w:p>
+            <w:pPr>
+              <w:spacing w:after="200" w:line="276" w:lineRule="auto"/>
+            </w:pPr>
+            <w:r>
+              <w:rPr>
+                <w:i/>
+                <w:iCs/>
+                <w:sz w:val="20"/>
+                <w:szCs w:val="20"/>
+              </w:rPr>
+              <w:t xml:space="preserve">Note. </w:t>
+            </w:r>
+            <w:r>
+              <w:rPr>
+                <w:sz w:val="20"/>
+                <w:szCs w:val="20"/>
+              </w:rPr>
+              <w:t>Screenshot taken by the author on 25 October 2026.</w:t>
+            </w:r>
+          </w:p>
+        </w:tc>
+        <w:tc>
+          <w:tcPr>
+            <w:tcW w:w="4513" w:type="dxa"/>
+          </w:tcPr>
+          <w:p>
+            <w:pPr>
+              <w:spacing w:before="120" w:line="264" w:lineRule="auto"/>
+            </w:pPr>
+            <w:r>
+              <w:rPr>
+                <w:b/>
+                <w:bCs/>
+              </w:rPr>
+              <w:t>Figure 4</w:t>
+            </w:r>
+          </w:p>
+          <w:p>
+            <w:pPr>
+              <w:spacing w:after="60" w:line="264" w:lineRule="auto"/>
+            </w:pPr>
+            <w:r>
+              <w:rPr>
+                <w:i/>
+                <w:iCs/>
+              </w:rPr>
+              <w:t>Gmail → Profile picture → Manage your Google Account → Security and sign-in</w:t>
+            </w:r>
+          </w:p>
+          <w:p>
+            <w:pPr>
+              <w:spacing w:before="60" w:after="60"/>
+              <w:jc w:val="center"/>
+            </w:pPr>
+            <w:r>
+              <w:rPr>
+                <w:noProof/>
+              </w:rPr>
+              <w:drawing>
+                <wp:inline distT="0" distB="0" distL="0" distR="0" wp14:anchorId="089BB2AF" wp14:editId="58228A76">
+                  <wp:extent cx="1828800" cy="1782064"/>
+                  <wp:effectExtent l="0" t="0" r="0" b="0"/>
+                  <wp:docPr id="1351789678" name="fig4" descr="Gmail → Profile picture → Manage your Google Account → Security and sign-in" title="Gmail → Profile picture → Manage your Google Account → Security and sign-in"/>
+                  <wp:cNvGraphicFramePr>
+                    <a:graphicFrameLocks xmlns:a="http://schemas.openxmlformats.org/drawingml/2006/main" noChangeAspect="1"/>
+                  </wp:cNvGraphicFramePr>
+                  <a:graphic xmlns:a="http://schemas.openxmlformats.org/drawingml/2006/main">
+                    <a:graphicData uri="http://schemas.openxmlformats.org/drawingml/2006/picture">
+                      <pic:pic xmlns:pic="http://schemas.openxmlformats.org/drawingml/2006/picture">
+                        <pic:nvPicPr>
+                          <pic:cNvPr id="0" name=""/>
+                          <pic:cNvPicPr>
+                            <a:picLocks noChangeAspect="1" noChangeArrowheads="1"/>
+                          </pic:cNvPicPr>
+                        </pic:nvPicPr>
+                        <pic:blipFill>
+                          <a:blip r:embed="rId11"/>
+                          <a:srcRect/>
+                          <a:stretch>
+                            <a:fillRect/>
+                          </a:stretch>
+                        </pic:blipFill>
+                        <pic:spPr bwMode="auto">
+                          <a:xfrm>
+                            <a:off x="0" y="0"/>
+                            <a:ext cx="1828800" cy="1782064"/>
+                          </a:xfrm>
+                          <a:prstGeom prst="rect">
+                            <a:avLst/>
+                          </a:prstGeom>
+                        </pic:spPr>
+                      </pic:pic>
+                    </a:graphicData>
+                  </a:graphic>
+                </wp:inline>
+              </w:drawing>
+            </w:r>
+          </w:p>
+          <w:p>
+            <w:pPr>
+              <w:spacing w:after="200" w:line="276" w:lineRule="auto"/>
+            </w:pPr>
+            <w:r>
+              <w:rPr>
+                <w:i/>
+                <w:iCs/>
+                <w:sz w:val="20"/>
+                <w:szCs w:val="20"/>
+              </w:rPr>
+              <w:t xml:space="preserve">Note. </w:t>
+            </w:r>
+            <w:r>
+              <w:rPr>
+                <w:sz w:val="20"/>
+                <w:szCs w:val="20"/>
+              </w:rPr>
+              <w:t>Screenshot taken by the author on 25 October 2026; personal details have been cropped out.</w:t>
+            </w:r>
+          </w:p>
+        </w:tc>
+      </w:tr>
+    </w:tbl>
+    <w:p>
+      <w:pPr>
+        <w:spacing w:before="0" w:after="0" w:line="120" w:lineRule="exact"/>
+      </w:pPr>
     </w:p>
     <w:p>
       <w:pPr>
@@ -844,7 +914,6 @@
     </w:p>
     <w:p>
       <w:pPr>
-        <w:keepNext/>
         <w:spacing w:before="120" w:line="360" w:lineRule="auto"/>
       </w:pPr>
       <w:r>
@@ -897,7 +966,7 @@
         </w:rPr>
         <w:drawing>
           <wp:inline distT="0" distB="0" distL="0" distR="0" wp14:anchorId="4026B51F" wp14:editId="27FF4174">
-            <wp:extent cx="1463040" cy="2540000"/>
+            <wp:extent cx="1188720" cy="2063750"/>
             <wp:effectExtent l="0" t="0" r="0" b="0"/>
             <wp:docPr id="1198581341" name="fig5" descr="bKash app → My Profile → Touch/Face ID (top) and the Forgot PIN screen (bottom)" title="bKash app → My Profile → Touch/Face ID (top) and the Forgot PIN screen (bottom)"/>
             <wp:cNvGraphicFramePr>
@@ -922,7 +991,7 @@
                   <pic:spPr bwMode="auto">
                     <a:xfrm>
                       <a:off x="0" y="0"/>
-                      <a:ext cx="1463040" cy="2540000"/>
+                      <a:ext cx="1188720" cy="2063750"/>
                     </a:xfrm>
                     <a:prstGeom prst="rect">
                       <a:avLst/>

</xml_diff>